<commit_message>
Quita una nota de borrador del diario grupal 2.1
Co-Authored-By: Claude Opus 5.5 <noreply@anthropic.com>
</commit_message>
<xml_diff>
--- a/Fase 2/Evidencias Grupales/2.1_APT122_DiarioReflexionFase2_Grupal.docx
+++ b/Fase 2/Evidencias Grupales/2.1_APT122_DiarioReflexionFase2_Grupal.docx
@@ -1930,40 +1930,6 @@
                 <w:rtl w:val="0"/>
               </w:rPr>
               <w:t xml:space="preserve">¿Cómo evalúan el trabajo en grupo? ¿Qué aspectos positivos destacan? ¿Qué aspectos podrían mejorar?</w:t>
-            </w:r>
-            <w:r>
-              <w:rPr>
-                <w:rtl w:val="0"/>
-              </w:rPr>
-            </w:r>
-          </w:p>
-          <w:p>
-            <w:pPr>
-              <w:spacing w:after="100" w:before="120" w:line="264" w:lineRule="auto"/>
-              <w:jc w:val="both"/>
-              <w:rPr/>
-            </w:pPr>
-            <w:r>
-              <w:rPr>
-                <w:rFonts w:ascii="Calibri" w:cs="Calibri" w:eastAsia="Calibri" w:hAnsi="Calibri"/>
-                <w:b w:val="1"/>
-                <w:bCs w:val="1"/>
-                <w:rtl w:val="0"/>
-              </w:rPr>
-              <w:t xml:space="preserve">Esta pregunta es una opinión del grupo: </w:t>
-            </w:r>
-            <w:r>
-              <w:rPr>
-                <w:rtl w:val="0"/>
-              </w:rPr>
-              <w:t xml:space="preserve">conversar entre</w:t>
-            </w:r>
-            <w:r>
-              <w:rPr>
-                <w:rFonts w:ascii="Calibri" w:cs="Calibri" w:eastAsia="Calibri" w:hAnsi="Calibri"/>
-                <w:rtl w:val="0"/>
-              </w:rPr>
-              <w:t xml:space="preserve"> los tres y escribir la respuesta en conjunto.</w:t>
             </w:r>
             <w:r>
               <w:rPr>

</xml_diff>